<commit_message>
feat: v1.1 — remove '(Voucher Included)' from course title on PPT/LP/LG covers
Superseded v1.0 deck moved to courseware/archive/; Document Version
Control Record updated with the 1.1 row.

Co-Authored-By: Claude Fable 5 <noreply@anthropic.com>
</commit_message>
<xml_diff>
--- a/courseware/LG-ITIL 4 Foundation Training.docx
+++ b/courseware/LG-ITIL 4 Foundation Training.docx
@@ -109,7 +109,7 @@
           <w:color w:val="111827"/>
           <w:sz w:val="40"/>
         </w:rPr>
-        <w:t>ITIL 4 Foundation Training (Voucher Included)</w:t>
+        <w:t>ITIL 4 Foundation Training</w:t>
       </w:r>
     </w:p>
     <w:p>
@@ -179,7 +179,7 @@
           <w:color w:val="1F6FEB"/>
           <w:sz w:val="24"/>
         </w:rPr>
-        <w:t>Version 1.0</w:t>
+        <w:t>Version 1.1</w:t>
       </w:r>
     </w:p>
     <w:p>
@@ -323,6 +323,64 @@
                 <w:sz w:val="19"/>
               </w:rPr>
               <w:t>Initial non-WSQ release (C348), mirrored from the ITIL 4 Foundation master courseware: five topics across three days, eight group labs on the BrightDesk Services scenario, and exam preparation for the included ITIL 4 Foundation exam voucher.</w:t>
+            </w:r>
+          </w:p>
+        </w:tc>
+        <w:tc>
+          <w:tcPr>
+            <w:tcW w:type="dxa" w:w="2160"/>
+          </w:tcPr>
+          <w:p>
+            <w:r/>
+            <w:r>
+              <w:rPr>
+                <w:sz w:val="19"/>
+              </w:rPr>
+              <w:t>Dr Alfred Ang</w:t>
+            </w:r>
+          </w:p>
+        </w:tc>
+      </w:tr>
+      <w:tr>
+        <w:tc>
+          <w:tcPr>
+            <w:tcW w:type="dxa" w:w="2160"/>
+          </w:tcPr>
+          <w:p>
+            <w:r/>
+            <w:r>
+              <w:rPr>
+                <w:sz w:val="19"/>
+              </w:rPr>
+              <w:t>1.1</w:t>
+            </w:r>
+          </w:p>
+        </w:tc>
+        <w:tc>
+          <w:tcPr>
+            <w:tcW w:type="dxa" w:w="2160"/>
+          </w:tcPr>
+          <w:p>
+            <w:r/>
+            <w:r>
+              <w:rPr>
+                <w:sz w:val="19"/>
+              </w:rPr>
+              <w:t>21 July 2026</w:t>
+            </w:r>
+          </w:p>
+        </w:tc>
+        <w:tc>
+          <w:tcPr>
+            <w:tcW w:type="dxa" w:w="2160"/>
+          </w:tcPr>
+          <w:p>
+            <w:r/>
+            <w:r>
+              <w:rPr>
+                <w:sz w:val="19"/>
+              </w:rPr>
+              <w:t>Course title simplified to 'ITIL 4 Foundation Training' (voucher wording removed from the document covers; the voucher itself is unchanged).</w:t>
             </w:r>
           </w:p>
         </w:tc>

</xml_diff>

<commit_message>
feat: v13.0 — replace trainer deck with full 259-slide SG master deck
The engine-generated 65-slide deck is superseded by the full master deck
(v12 lineage) adapted for C348: programme-only admin content and framework
code references removed, cover retitled. LP/LG version-aligned to 13.0;
v1.1 artifacts archived.

Co-Authored-By: Claude Fable 5 <noreply@anthropic.com>
</commit_message>
<xml_diff>
--- a/courseware/LG-ITIL 4 Foundation Training.docx
+++ b/courseware/LG-ITIL 4 Foundation Training.docx
@@ -179,7 +179,7 @@
           <w:color w:val="1F6FEB"/>
           <w:sz w:val="24"/>
         </w:rPr>
-        <w:t>Version 1.1</w:t>
+        <w:t>Version 13.0</w:t>
       </w:r>
     </w:p>
     <w:p>
@@ -381,6 +381,64 @@
                 <w:sz w:val="19"/>
               </w:rPr>
               <w:t>Course title simplified to 'ITIL 4 Foundation Training' (voucher wording removed from the document covers; the voucher itself is unchanged).</w:t>
+            </w:r>
+          </w:p>
+        </w:tc>
+        <w:tc>
+          <w:tcPr>
+            <w:tcW w:type="dxa" w:w="2160"/>
+          </w:tcPr>
+          <w:p>
+            <w:r/>
+            <w:r>
+              <w:rPr>
+                <w:sz w:val="19"/>
+              </w:rPr>
+              <w:t>Dr Alfred Ang</w:t>
+            </w:r>
+          </w:p>
+        </w:tc>
+      </w:tr>
+      <w:tr>
+        <w:tc>
+          <w:tcPr>
+            <w:tcW w:type="dxa" w:w="2160"/>
+          </w:tcPr>
+          <w:p>
+            <w:r/>
+            <w:r>
+              <w:rPr>
+                <w:sz w:val="19"/>
+              </w:rPr>
+              <w:t>13.0</w:t>
+            </w:r>
+          </w:p>
+        </w:tc>
+        <w:tc>
+          <w:tcPr>
+            <w:tcW w:type="dxa" w:w="2160"/>
+          </w:tcPr>
+          <w:p>
+            <w:r/>
+            <w:r>
+              <w:rPr>
+                <w:sz w:val="19"/>
+              </w:rPr>
+              <w:t>21 July 2026</w:t>
+            </w:r>
+          </w:p>
+        </w:tc>
+        <w:tc>
+          <w:tcPr>
+            <w:tcW w:type="dxa" w:w="2160"/>
+          </w:tcPr>
+          <w:p>
+            <w:r/>
+            <w:r>
+              <w:rPr>
+                <w:sz w:val="19"/>
+              </w:rPr>
+              <w:t>Trainer deck replaced with the full 259-slide SG master deck (v12 lineage), adapted for the C348 short course: programme-only admin content and framework code references removed, cover retitled. Version aligned to the master-deck lineage across LP and LG.</w:t>
             </w:r>
           </w:p>
         </w:tc>

</xml_diff>